<commit_message>
Cierre de Iteracion 7: Implementacion de API REST y empaquetado con Docker
</commit_message>
<xml_diff>
--- a/docs/Reporte_Semana03_Monitoreo_Ciberseguridad_CarlosReyez.docx
+++ b/docs/Reporte_Semana03_Monitoreo_Ciberseguridad_CarlosReyez.docx
@@ -517,18 +517,79 @@
         <w:t>: Herramientas críticas integradas para el análisis estático de código y formateo automático bajo el estándar PEP 8.</w:t>
       </w:r>
     </w:p>
-    <w:p/>
     <w:p>
-      <w:r>
-        <w:rPr>
-          <w:noProof/>
+      <w:pPr>
+        <w:jc w:val="both"/>
+        <w:rPr>
+          <w:rFonts w:ascii="Arial" w:hAnsi="Arial" w:cs="Arial"/>
+        </w:rPr>
+      </w:pPr>
+      <w:r>
+        <w:rPr>
+          <w:rFonts w:ascii="Arial" w:hAnsi="Arial" w:cs="Arial"/>
+        </w:rPr>
+        <w:t xml:space="preserve">Adicionalmente, para cumplir con los requerimientos de la arquitectura propuesta, se integró Docker como herramienta de </w:t>
+      </w:r>
+      <w:proofErr w:type="spellStart"/>
+      <w:r>
+        <w:rPr>
+          <w:rFonts w:ascii="Arial" w:hAnsi="Arial" w:cs="Arial"/>
+        </w:rPr>
+        <w:t>contenedorización</w:t>
+      </w:r>
+      <w:proofErr w:type="spellEnd"/>
+      <w:r>
+        <w:rPr>
+          <w:rFonts w:ascii="Arial" w:hAnsi="Arial" w:cs="Arial"/>
+        </w:rPr>
+        <w:t>. Se generó el archivo de configuración base (</w:t>
+      </w:r>
+      <w:proofErr w:type="spellStart"/>
+      <w:r>
+        <w:rPr>
+          <w:rFonts w:ascii="Arial" w:hAnsi="Arial" w:cs="Arial"/>
+        </w:rPr>
+        <w:t>Dockerfile</w:t>
+      </w:r>
+      <w:proofErr w:type="spellEnd"/>
+      <w:r>
+        <w:rPr>
+          <w:rFonts w:ascii="Arial" w:hAnsi="Arial" w:cs="Arial"/>
+        </w:rPr>
+        <w:t>) en la raíz del proyecto para definir el entorno de ejecución estandarizado. Aunque durante la fase de desarrollo local se priorizó el uso del entorno virtual (.</w:t>
+      </w:r>
+      <w:proofErr w:type="spellStart"/>
+      <w:r>
+        <w:rPr>
+          <w:rFonts w:ascii="Arial" w:hAnsi="Arial" w:cs="Arial"/>
+        </w:rPr>
+        <w:t>venv</w:t>
+      </w:r>
+      <w:proofErr w:type="spellEnd"/>
+      <w:r>
+        <w:rPr>
+          <w:rFonts w:ascii="Arial" w:hAnsi="Arial" w:cs="Arial"/>
+        </w:rPr>
+        <w:t>) para mayor agilidad, la configuración de Docker quedó establecida desde esta etapa para garantizar que el despliegue final del sistema sea portátil, autocontenido y completamente independiente del sistema operativo anfitrión.</w:t>
+      </w:r>
+    </w:p>
+    <w:p>
+      <w:pPr>
+        <w:jc w:val="both"/>
+        <w:rPr>
+          <w:rFonts w:ascii="Arial" w:hAnsi="Arial" w:cs="Arial"/>
+        </w:rPr>
+      </w:pPr>
+      <w:r>
+        <w:rPr>
+          <w:rFonts w:ascii="Arial" w:hAnsi="Arial" w:cs="Arial"/>
         </w:rPr>
         <w:lastRenderedPageBreak/>
         <w:drawing>
-          <wp:inline distT="0" distB="0" distL="0" distR="0" wp14:anchorId="499BEDCF" wp14:editId="1D79866A">
-            <wp:extent cx="5612130" cy="2995295"/>
+          <wp:inline distT="0" distB="0" distL="0" distR="0" wp14:anchorId="2A14713F" wp14:editId="07275737">
+            <wp:extent cx="5612130" cy="2863850"/>
             <wp:effectExtent l="0" t="0" r="7620" b="0"/>
-            <wp:docPr id="3" name="Imagen 3"/>
+            <wp:docPr id="2" name="Imagen 2"/>
             <wp:cNvGraphicFramePr>
               <a:graphicFrameLocks xmlns:a="http://schemas.openxmlformats.org/drawingml/2006/main" noChangeAspect="1"/>
             </wp:cNvGraphicFramePr>
@@ -548,7 +609,7 @@
                   <pic:spPr>
                     <a:xfrm>
                       <a:off x="0" y="0"/>
-                      <a:ext cx="5612130" cy="2995295"/>
+                      <a:ext cx="5612130" cy="2863850"/>
                     </a:xfrm>
                     <a:prstGeom prst="rect">
                       <a:avLst/>
@@ -561,147 +622,25 @@
         </w:drawing>
       </w:r>
     </w:p>
+    <w:p>
+      <w:pPr>
+        <w:jc w:val="both"/>
+        <w:rPr>
+          <w:rFonts w:ascii="Arial" w:hAnsi="Arial" w:cs="Arial"/>
+        </w:rPr>
+      </w:pPr>
+    </w:p>
     <w:p/>
     <w:p>
-      <w:pPr>
-        <w:rPr>
-          <w:rFonts w:ascii="Arial" w:hAnsi="Arial" w:cs="Arial"/>
-        </w:rPr>
-      </w:pPr>
-      <w:r>
-        <w:rPr>
-          <w:rFonts w:ascii="Arial" w:hAnsi="Arial" w:cs="Arial"/>
-          <w:b/>
-          <w:bCs/>
-        </w:rPr>
-        <w:t>Inicializar proyecto y Validar el entorno con una prueba de humo</w:t>
-      </w:r>
-      <w:r>
-        <w:rPr>
-          <w:rFonts w:ascii="Arial" w:hAnsi="Arial" w:cs="Arial"/>
-        </w:rPr>
-        <w:t xml:space="preserve"> </w:t>
-      </w:r>
-    </w:p>
-    <w:p>
-      <w:pPr>
-        <w:jc w:val="both"/>
-        <w:rPr>
-          <w:rFonts w:ascii="Arial" w:hAnsi="Arial" w:cs="Arial"/>
-        </w:rPr>
-      </w:pPr>
-      <w:r>
-        <w:rPr>
-          <w:rFonts w:ascii="Arial" w:hAnsi="Arial" w:cs="Arial"/>
-        </w:rPr>
-        <w:t>Para consolidar la integración de los componentes base definidos en el diagrama de arquitectura UML, se realizaron dos acciones críticas de configuración en el espacio de trabajo local:</w:t>
-      </w:r>
-    </w:p>
-    <w:p>
-      <w:pPr>
-        <w:numPr>
-          <w:ilvl w:val="0"/>
-          <w:numId w:val="3"/>
-        </w:numPr>
-        <w:jc w:val="both"/>
-        <w:rPr>
-          <w:rFonts w:ascii="Arial" w:hAnsi="Arial" w:cs="Arial"/>
-        </w:rPr>
-      </w:pPr>
-      <w:r>
-        <w:rPr>
-          <w:rFonts w:ascii="Arial" w:hAnsi="Arial" w:cs="Arial"/>
-          <w:b/>
-          <w:bCs/>
-        </w:rPr>
-        <w:t>Inicialización del paquete (__init__.py)</w:t>
-      </w:r>
-      <w:r>
-        <w:rPr>
-          <w:rFonts w:ascii="Arial" w:hAnsi="Arial" w:cs="Arial"/>
-        </w:rPr>
-        <w:t>: Se generó un archivo de inicialización vacío dentro del directorio /</w:t>
-      </w:r>
-      <w:proofErr w:type="spellStart"/>
-      <w:r>
-        <w:rPr>
-          <w:rFonts w:ascii="Arial" w:hAnsi="Arial" w:cs="Arial"/>
-        </w:rPr>
-        <w:t>src</w:t>
-      </w:r>
-      <w:proofErr w:type="spellEnd"/>
-      <w:r>
-        <w:rPr>
-          <w:rFonts w:ascii="Arial" w:hAnsi="Arial" w:cs="Arial"/>
-        </w:rPr>
-        <w:t xml:space="preserve">. Esta acción bajo los estándares de Python convierte la carpeta en un módulo formal, previniendo errores de importación relativos y permitiendo la intercomunicación limpia entre los componentes del núcleo de captura y la futura interfaz de </w:t>
-      </w:r>
-      <w:proofErr w:type="spellStart"/>
-      <w:r>
-        <w:rPr>
-          <w:rFonts w:ascii="Arial" w:hAnsi="Arial" w:cs="Arial"/>
-        </w:rPr>
-        <w:t>Flask</w:t>
-      </w:r>
-      <w:proofErr w:type="spellEnd"/>
-      <w:r>
-        <w:rPr>
-          <w:rFonts w:ascii="Arial" w:hAnsi="Arial" w:cs="Arial"/>
-        </w:rPr>
-        <w:t>.</w:t>
-      </w:r>
-    </w:p>
-    <w:p>
-      <w:pPr>
-        <w:numPr>
-          <w:ilvl w:val="0"/>
-          <w:numId w:val="3"/>
-        </w:numPr>
-        <w:jc w:val="both"/>
-        <w:rPr>
-          <w:rFonts w:ascii="Arial" w:hAnsi="Arial" w:cs="Arial"/>
-        </w:rPr>
-      </w:pPr>
-      <w:r>
-        <w:rPr>
-          <w:rFonts w:ascii="Arial" w:hAnsi="Arial" w:cs="Arial"/>
-          <w:b/>
-          <w:bCs/>
-        </w:rPr>
-        <w:t>Prueba de Humo</w:t>
-      </w:r>
-      <w:r>
-        <w:rPr>
-          <w:rFonts w:ascii="Arial" w:hAnsi="Arial" w:cs="Arial"/>
-        </w:rPr>
-        <w:t xml:space="preserve">: Se ejecutó el componente principal main.py para validar que el ecosistema de ejecución local responda adecuadamente y sea capaz de interactuar con el Sistema Operativo Host utilizando las librerías nativas socket y </w:t>
-      </w:r>
-      <w:proofErr w:type="spellStart"/>
-      <w:r>
-        <w:rPr>
-          <w:rFonts w:ascii="Arial" w:hAnsi="Arial" w:cs="Arial"/>
-        </w:rPr>
-        <w:t>platform</w:t>
-      </w:r>
-      <w:proofErr w:type="spellEnd"/>
-      <w:r>
-        <w:rPr>
-          <w:rFonts w:ascii="Arial" w:hAnsi="Arial" w:cs="Arial"/>
-        </w:rPr>
-        <w:t>.</w:t>
-      </w:r>
-    </w:p>
-    <w:p>
       <w:r>
         <w:rPr>
           <w:noProof/>
         </w:rPr>
-        <w:lastRenderedPageBreak/>
         <w:drawing>
-          <wp:inline distT="0" distB="0" distL="0" distR="0" wp14:anchorId="1117462E" wp14:editId="2DB9761E">
-            <wp:extent cx="5612130" cy="2996565"/>
+          <wp:inline distT="0" distB="0" distL="0" distR="0" wp14:anchorId="499BEDCF" wp14:editId="1D79866A">
+            <wp:extent cx="5612130" cy="2995295"/>
             <wp:effectExtent l="0" t="0" r="7620" b="0"/>
-            <wp:docPr id="4" name="Imagen 4"/>
+            <wp:docPr id="3" name="Imagen 3"/>
             <wp:cNvGraphicFramePr>
               <a:graphicFrameLocks xmlns:a="http://schemas.openxmlformats.org/drawingml/2006/main" noChangeAspect="1"/>
             </wp:cNvGraphicFramePr>
@@ -721,6 +660,179 @@
                   <pic:spPr>
                     <a:xfrm>
                       <a:off x="0" y="0"/>
+                      <a:ext cx="5612130" cy="2995295"/>
+                    </a:xfrm>
+                    <a:prstGeom prst="rect">
+                      <a:avLst/>
+                    </a:prstGeom>
+                  </pic:spPr>
+                </pic:pic>
+              </a:graphicData>
+            </a:graphic>
+          </wp:inline>
+        </w:drawing>
+      </w:r>
+    </w:p>
+    <w:p/>
+    <w:p>
+      <w:pPr>
+        <w:rPr>
+          <w:rFonts w:ascii="Arial" w:hAnsi="Arial" w:cs="Arial"/>
+        </w:rPr>
+      </w:pPr>
+      <w:r>
+        <w:rPr>
+          <w:rFonts w:ascii="Arial" w:hAnsi="Arial" w:cs="Arial"/>
+          <w:b/>
+          <w:bCs/>
+        </w:rPr>
+        <w:t>Inicializar proyecto y Validar el entorno con una prueba de humo</w:t>
+      </w:r>
+      <w:r>
+        <w:rPr>
+          <w:rFonts w:ascii="Arial" w:hAnsi="Arial" w:cs="Arial"/>
+        </w:rPr>
+        <w:t xml:space="preserve"> </w:t>
+      </w:r>
+    </w:p>
+    <w:p>
+      <w:pPr>
+        <w:jc w:val="both"/>
+        <w:rPr>
+          <w:rFonts w:ascii="Arial" w:hAnsi="Arial" w:cs="Arial"/>
+        </w:rPr>
+      </w:pPr>
+      <w:r>
+        <w:rPr>
+          <w:rFonts w:ascii="Arial" w:hAnsi="Arial" w:cs="Arial"/>
+        </w:rPr>
+        <w:t>Para consolidar la integración de los componentes base definidos en el diagrama de arquitectura UML, se realizaron dos acciones críticas de configuración en el espacio de trabajo local:</w:t>
+      </w:r>
+    </w:p>
+    <w:p>
+      <w:pPr>
+        <w:numPr>
+          <w:ilvl w:val="0"/>
+          <w:numId w:val="3"/>
+        </w:numPr>
+        <w:jc w:val="both"/>
+        <w:rPr>
+          <w:rFonts w:ascii="Arial" w:hAnsi="Arial" w:cs="Arial"/>
+        </w:rPr>
+      </w:pPr>
+      <w:r>
+        <w:rPr>
+          <w:rFonts w:ascii="Arial" w:hAnsi="Arial" w:cs="Arial"/>
+          <w:b/>
+          <w:bCs/>
+        </w:rPr>
+        <w:lastRenderedPageBreak/>
+        <w:t>Inicialización del paquete (__init__.py)</w:t>
+      </w:r>
+      <w:r>
+        <w:rPr>
+          <w:rFonts w:ascii="Arial" w:hAnsi="Arial" w:cs="Arial"/>
+        </w:rPr>
+        <w:t>: Se generó un archivo de inicialización vacío dentro del directorio /</w:t>
+      </w:r>
+      <w:proofErr w:type="spellStart"/>
+      <w:r>
+        <w:rPr>
+          <w:rFonts w:ascii="Arial" w:hAnsi="Arial" w:cs="Arial"/>
+        </w:rPr>
+        <w:t>src</w:t>
+      </w:r>
+      <w:proofErr w:type="spellEnd"/>
+      <w:r>
+        <w:rPr>
+          <w:rFonts w:ascii="Arial" w:hAnsi="Arial" w:cs="Arial"/>
+        </w:rPr>
+        <w:t xml:space="preserve">. Esta acción bajo los estándares de Python convierte la carpeta en un módulo formal, previniendo errores de importación relativos y permitiendo la intercomunicación limpia entre los componentes del núcleo de captura y la futura interfaz de </w:t>
+      </w:r>
+      <w:proofErr w:type="spellStart"/>
+      <w:r>
+        <w:rPr>
+          <w:rFonts w:ascii="Arial" w:hAnsi="Arial" w:cs="Arial"/>
+        </w:rPr>
+        <w:t>Flask</w:t>
+      </w:r>
+      <w:proofErr w:type="spellEnd"/>
+      <w:r>
+        <w:rPr>
+          <w:rFonts w:ascii="Arial" w:hAnsi="Arial" w:cs="Arial"/>
+        </w:rPr>
+        <w:t>.</w:t>
+      </w:r>
+    </w:p>
+    <w:p>
+      <w:pPr>
+        <w:numPr>
+          <w:ilvl w:val="0"/>
+          <w:numId w:val="3"/>
+        </w:numPr>
+        <w:jc w:val="both"/>
+        <w:rPr>
+          <w:rFonts w:ascii="Arial" w:hAnsi="Arial" w:cs="Arial"/>
+        </w:rPr>
+      </w:pPr>
+      <w:r>
+        <w:rPr>
+          <w:rFonts w:ascii="Arial" w:hAnsi="Arial" w:cs="Arial"/>
+          <w:b/>
+          <w:bCs/>
+        </w:rPr>
+        <w:t>Prueba de Humo</w:t>
+      </w:r>
+      <w:r>
+        <w:rPr>
+          <w:rFonts w:ascii="Arial" w:hAnsi="Arial" w:cs="Arial"/>
+        </w:rPr>
+        <w:t xml:space="preserve">: Se ejecutó el componente principal main.py para validar que el ecosistema de ejecución local responda adecuadamente y sea capaz de interactuar con el Sistema Operativo Host utilizando las librerías nativas socket y </w:t>
+      </w:r>
+      <w:proofErr w:type="spellStart"/>
+      <w:r>
+        <w:rPr>
+          <w:rFonts w:ascii="Arial" w:hAnsi="Arial" w:cs="Arial"/>
+        </w:rPr>
+        <w:t>platform</w:t>
+      </w:r>
+      <w:proofErr w:type="spellEnd"/>
+      <w:r>
+        <w:rPr>
+          <w:rFonts w:ascii="Arial" w:hAnsi="Arial" w:cs="Arial"/>
+        </w:rPr>
+        <w:t>.</w:t>
+      </w:r>
+    </w:p>
+    <w:p>
+      <w:r>
+        <w:rPr>
+          <w:noProof/>
+        </w:rPr>
+        <w:drawing>
+          <wp:inline distT="0" distB="0" distL="0" distR="0" wp14:anchorId="1117462E" wp14:editId="2DB9761E">
+            <wp:extent cx="5612130" cy="2996565"/>
+            <wp:effectExtent l="0" t="0" r="7620" b="0"/>
+            <wp:docPr id="4" name="Imagen 4"/>
+            <wp:cNvGraphicFramePr>
+              <a:graphicFrameLocks xmlns:a="http://schemas.openxmlformats.org/drawingml/2006/main" noChangeAspect="1"/>
+            </wp:cNvGraphicFramePr>
+            <a:graphic xmlns:a="http://schemas.openxmlformats.org/drawingml/2006/main">
+              <a:graphicData uri="http://schemas.openxmlformats.org/drawingml/2006/picture">
+                <pic:pic xmlns:pic="http://schemas.openxmlformats.org/drawingml/2006/picture">
+                  <pic:nvPicPr>
+                    <pic:cNvPr id="1" name=""/>
+                    <pic:cNvPicPr/>
+                  </pic:nvPicPr>
+                  <pic:blipFill>
+                    <a:blip r:embed="rId8"/>
+                    <a:stretch>
+                      <a:fillRect/>
+                    </a:stretch>
+                  </pic:blipFill>
+                  <pic:spPr>
+                    <a:xfrm>
+                      <a:off x="0" y="0"/>
                       <a:ext cx="5612130" cy="2996565"/>
                     </a:xfrm>
                     <a:prstGeom prst="rect">
@@ -818,6 +930,7 @@
           <w:b/>
           <w:bCs/>
         </w:rPr>
+        <w:lastRenderedPageBreak/>
         <w:t>Aislamiento de Entornos:</w:t>
       </w:r>
       <w:r>
@@ -860,11 +973,7 @@
       </w:r>
       <w:proofErr w:type="spellEnd"/>
       <w:r>
-        <w:t xml:space="preserve"> estabilizado requirements.txt hacia el repositorio remoto en GitHub mediante </w:t>
-      </w:r>
-      <w:r>
-        <w:lastRenderedPageBreak/>
-        <w:t xml:space="preserve">los comandos de control de versiones </w:t>
+        <w:t xml:space="preserve"> estabilizado requirements.txt hacia el repositorio remoto en GitHub mediante los comandos de control de versiones </w:t>
       </w:r>
       <w:proofErr w:type="spellStart"/>
       <w:r>

</xml_diff>